<commit_message>
:books: docks - Sprint 16 task 180 com data corrigida
</commit_message>
<xml_diff>
--- a/Documentation/WORD/Sprint16_Task180_Componentização.docx
+++ b/Documentation/WORD/Sprint16_Task180_Componentização.docx
@@ -1,6 +1,6 @@
 
 <file path=word/document.xml><?xml version="1.0" encoding="utf-8"?>
-<w:document xmlns:wpc="http://schemas.microsoft.com/office/word/2010/wordprocessingCanvas" xmlns:cx="http://schemas.microsoft.com/office/drawing/2014/chartex" xmlns:cx1="http://schemas.microsoft.com/office/drawing/2015/9/8/chartex" xmlns:cx2="http://schemas.microsoft.com/office/drawing/2015/10/21/chartex" xmlns:cx3="http://schemas.microsoft.com/office/drawing/2016/5/9/chartex" xmlns:cx4="http://schemas.microsoft.com/office/drawing/2016/5/10/chartex" xmlns:cx5="http://schemas.microsoft.com/office/drawing/2016/5/11/chartex" xmlns:cx6="http://schemas.microsoft.com/office/drawing/2016/5/12/chartex" xmlns:cx7="http://schemas.microsoft.com/office/drawing/2016/5/13/chartex" xmlns:cx8="http://schemas.microsoft.com/office/drawing/2016/5/14/chartex" xmlns:mc="http://schemas.openxmlformats.org/markup-compatibility/2006" xmlns:aink="http://schemas.microsoft.com/office/drawing/2016/ink" xmlns:am3d="http://schemas.microsoft.com/office/drawing/2017/model3d" xmlns:o="urn:schemas-microsoft-com:office:office" xmlns:oel="http://schemas.microsoft.com/office/2019/extlst" xmlns:r="http://schemas.openxmlformats.org/officeDocument/2006/relationships" xmlns:m="http://schemas.openxmlformats.org/officeDocument/2006/math" xmlns:v="urn:schemas-microsoft-com:vml" xmlns:wp14="http://schemas.microsoft.com/office/word/2010/wordprocessingDrawing" xmlns:wp="http://schemas.openxmlformats.org/drawingml/2006/wordprocessingDrawing" xmlns:w10="urn:schemas-microsoft-com:office:word" xmlns:w="http://schemas.openxmlformats.org/wordprocessingml/2006/main" xmlns:w14="http://schemas.microsoft.com/office/word/2010/wordml" xmlns:w15="http://schemas.microsoft.com/office/word/2012/wordml" xmlns:w16cex="http://schemas.microsoft.com/office/word/2018/wordml/cex" xmlns:w16cid="http://schemas.microsoft.com/office/word/2016/wordml/cid" xmlns:w16="http://schemas.microsoft.com/office/word/2018/wordml" xmlns:w16du="http://schemas.microsoft.com/office/word/2023/wordml/word16du" xmlns:w16sdtdh="http://schemas.microsoft.com/office/word/2020/wordml/sdtdatahash" xmlns:w16sdtfl="http://schemas.microsoft.com/office/word/2024/wordml/sdtformatlock" xmlns:w16se="http://schemas.microsoft.com/office/word/2015/wordml/symex" xmlns:wpg="http://schemas.microsoft.com/office/word/2010/wordprocessingGroup" xmlns:wpi="http://schemas.microsoft.com/office/word/2010/wordprocessingInk" xmlns:wne="http://schemas.microsoft.com/office/word/2006/wordml" xmlns:wps="http://schemas.microsoft.com/office/word/2010/wordprocessingShape" mc:Ignorable="w14 w15 w16se w16cid w16 w16cex w16sdtdh w16sdtfl w16du wp14">
+<w:document xmlns:wpc="http://schemas.microsoft.com/office/word/2010/wordprocessingCanvas" xmlns:cx="http://schemas.microsoft.com/office/drawing/2014/chartex" xmlns:cx1="http://schemas.microsoft.com/office/drawing/2015/9/8/chartex" xmlns:cx2="http://schemas.microsoft.com/office/drawing/2015/10/21/chartex" xmlns:cx3="http://schemas.microsoft.com/office/drawing/2016/5/9/chartex" xmlns:cx4="http://schemas.microsoft.com/office/drawing/2016/5/10/chartex" xmlns:cx5="http://schemas.microsoft.com/office/drawing/2016/5/11/chartex" xmlns:cx6="http://schemas.microsoft.com/office/drawing/2016/5/12/chartex" xmlns:cx7="http://schemas.microsoft.com/office/drawing/2016/5/13/chartex" xmlns:cx8="http://schemas.microsoft.com/office/drawing/2016/5/14/chartex" xmlns:mc="http://schemas.openxmlformats.org/markup-compatibility/2006" xmlns:aink="http://schemas.microsoft.com/office/drawing/2016/ink" xmlns:am3d="http://schemas.microsoft.com/office/drawing/2017/model3d" xmlns:o="urn:schemas-microsoft-com:office:office" xmlns:oel="http://schemas.microsoft.com/office/2019/extlst" xmlns:r="http://schemas.openxmlformats.org/officeDocument/2006/relationships" xmlns:m="http://schemas.openxmlformats.org/officeDocument/2006/math" xmlns:v="urn:schemas-microsoft-com:vml" xmlns:wp14="http://schemas.microsoft.com/office/word/2010/wordprocessingDrawing" xmlns:wp="http://schemas.openxmlformats.org/drawingml/2006/wordprocessingDrawing" xmlns:w10="urn:schemas-microsoft-com:office:word" xmlns:w="http://schemas.openxmlformats.org/wordprocessingml/2006/main" xmlns:w14="http://schemas.microsoft.com/office/word/2010/wordml" xmlns:w15="http://schemas.microsoft.com/office/word/2012/wordml" xmlns:w16cex="http://schemas.microsoft.com/office/word/2018/wordml/cex" xmlns:w16cid="http://schemas.microsoft.com/office/word/2016/wordml/cid" xmlns:w16="http://schemas.microsoft.com/office/word/2018/wordml" xmlns:w16sdtdh="http://schemas.microsoft.com/office/word/2020/wordml/sdtdatahash" xmlns:w16se="http://schemas.microsoft.com/office/word/2015/wordml/symex" xmlns:wpg="http://schemas.microsoft.com/office/word/2010/wordprocessingGroup" xmlns:wpi="http://schemas.microsoft.com/office/word/2010/wordprocessingInk" xmlns:wne="http://schemas.microsoft.com/office/word/2006/wordml" xmlns:wps="http://schemas.microsoft.com/office/word/2010/wordprocessingShape" mc:Ignorable="w14 w15 w16se w16cid w16 w16cex w16sdtdh wp14">
   <w:body>
     <w:p>
       <w:pPr>
@@ -210,7 +210,21 @@
                 <w:b/>
                 <w:bCs/>
               </w:rPr>
-              <w:t>Projetc Name:</w:t>
+              <w:t>Proje</w:t>
+            </w:r>
+            <w:r>
+              <w:rPr>
+                <w:b/>
+                <w:bCs/>
+              </w:rPr>
+              <w:t>ct</w:t>
+            </w:r>
+            <w:r>
+              <w:rPr>
+                <w:b/>
+                <w:bCs/>
+              </w:rPr>
+              <w:t xml:space="preserve"> Name:</w:t>
             </w:r>
           </w:p>
         </w:tc>
@@ -436,7 +450,16 @@
           </w:tcPr>
           <w:p>
             <w:r>
-              <w:t>01/05/2029</w:t>
+              <w:t>01/0</w:t>
+            </w:r>
+            <w:r>
+              <w:t>6</w:t>
+            </w:r>
+            <w:r>
+              <w:t>/202</w:t>
+            </w:r>
+            <w:r>
+              <w:t>6</w:t>
             </w:r>
           </w:p>
         </w:tc>
@@ -1046,6 +1069,9 @@
         <w:spacing w:line="360" w:lineRule="auto"/>
       </w:pPr>
       <w:r>
+        <w:rPr>
+          <w:noProof/>
+        </w:rPr>
         <w:lastRenderedPageBreak/>
         <w:drawing>
           <wp:inline distT="0" distB="0" distL="0" distR="0" wp14:anchorId="5050FC43" wp14:editId="6087864A">
@@ -1102,6 +1128,9 @@
         <w:spacing w:line="360" w:lineRule="auto"/>
       </w:pPr>
       <w:r>
+        <w:rPr>
+          <w:noProof/>
+        </w:rPr>
         <w:lastRenderedPageBreak/>
         <w:drawing>
           <wp:inline distT="0" distB="0" distL="0" distR="0" wp14:anchorId="2468A601" wp14:editId="7192E313">
@@ -1158,6 +1187,9 @@
         <w:spacing w:line="360" w:lineRule="auto"/>
       </w:pPr>
       <w:r>
+        <w:rPr>
+          <w:noProof/>
+        </w:rPr>
         <w:drawing>
           <wp:inline distT="0" distB="0" distL="0" distR="0" wp14:anchorId="6F43DF19" wp14:editId="758386D8">
             <wp:extent cx="6472555" cy="4494530"/>
@@ -1213,6 +1245,9 @@
         <w:spacing w:line="360" w:lineRule="auto"/>
       </w:pPr>
       <w:r>
+        <w:rPr>
+          <w:noProof/>
+        </w:rPr>
         <w:lastRenderedPageBreak/>
         <w:drawing>
           <wp:inline distT="0" distB="0" distL="0" distR="0" wp14:anchorId="225BE56F" wp14:editId="31600059">
@@ -1291,7 +1326,7 @@
 </file>
 
 <file path=word/endnotes.xml><?xml version="1.0" encoding="utf-8"?>
-<w:endnotes xmlns:wpc="http://schemas.microsoft.com/office/word/2010/wordprocessingCanvas" xmlns:cx="http://schemas.microsoft.com/office/drawing/2014/chartex" xmlns:cx1="http://schemas.microsoft.com/office/drawing/2015/9/8/chartex" xmlns:cx2="http://schemas.microsoft.com/office/drawing/2015/10/21/chartex" xmlns:cx3="http://schemas.microsoft.com/office/drawing/2016/5/9/chartex" xmlns:cx4="http://schemas.microsoft.com/office/drawing/2016/5/10/chartex" xmlns:cx5="http://schemas.microsoft.com/office/drawing/2016/5/11/chartex" xmlns:cx6="http://schemas.microsoft.com/office/drawing/2016/5/12/chartex" xmlns:cx7="http://schemas.microsoft.com/office/drawing/2016/5/13/chartex" xmlns:cx8="http://schemas.microsoft.com/office/drawing/2016/5/14/chartex" xmlns:mc="http://schemas.openxmlformats.org/markup-compatibility/2006" xmlns:aink="http://schemas.microsoft.com/office/drawing/2016/ink" xmlns:am3d="http://schemas.microsoft.com/office/drawing/2017/model3d" xmlns:o="urn:schemas-microsoft-com:office:office" xmlns:oel="http://schemas.microsoft.com/office/2019/extlst" xmlns:r="http://schemas.openxmlformats.org/officeDocument/2006/relationships" xmlns:m="http://schemas.openxmlformats.org/officeDocument/2006/math" xmlns:v="urn:schemas-microsoft-com:vml" xmlns:wp14="http://schemas.microsoft.com/office/word/2010/wordprocessingDrawing" xmlns:wp="http://schemas.openxmlformats.org/drawingml/2006/wordprocessingDrawing" xmlns:w10="urn:schemas-microsoft-com:office:word" xmlns:w="http://schemas.openxmlformats.org/wordprocessingml/2006/main" xmlns:w14="http://schemas.microsoft.com/office/word/2010/wordml" xmlns:w15="http://schemas.microsoft.com/office/word/2012/wordml" xmlns:w16cex="http://schemas.microsoft.com/office/word/2018/wordml/cex" xmlns:w16cid="http://schemas.microsoft.com/office/word/2016/wordml/cid" xmlns:w16="http://schemas.microsoft.com/office/word/2018/wordml" xmlns:w16du="http://schemas.microsoft.com/office/word/2023/wordml/word16du" xmlns:w16sdtdh="http://schemas.microsoft.com/office/word/2020/wordml/sdtdatahash" xmlns:w16sdtfl="http://schemas.microsoft.com/office/word/2024/wordml/sdtformatlock" xmlns:w16se="http://schemas.microsoft.com/office/word/2015/wordml/symex" xmlns:wpg="http://schemas.microsoft.com/office/word/2010/wordprocessingGroup" xmlns:wpi="http://schemas.microsoft.com/office/word/2010/wordprocessingInk" xmlns:wne="http://schemas.microsoft.com/office/word/2006/wordml" xmlns:wps="http://schemas.microsoft.com/office/word/2010/wordprocessingShape" mc:Ignorable="w14 w15 w16se w16cid w16 w16cex w16sdtdh w16sdtfl w16du wp14">
+<w:endnotes xmlns:wpc="http://schemas.microsoft.com/office/word/2010/wordprocessingCanvas" xmlns:cx="http://schemas.microsoft.com/office/drawing/2014/chartex" xmlns:cx1="http://schemas.microsoft.com/office/drawing/2015/9/8/chartex" xmlns:cx2="http://schemas.microsoft.com/office/drawing/2015/10/21/chartex" xmlns:cx3="http://schemas.microsoft.com/office/drawing/2016/5/9/chartex" xmlns:cx4="http://schemas.microsoft.com/office/drawing/2016/5/10/chartex" xmlns:cx5="http://schemas.microsoft.com/office/drawing/2016/5/11/chartex" xmlns:cx6="http://schemas.microsoft.com/office/drawing/2016/5/12/chartex" xmlns:cx7="http://schemas.microsoft.com/office/drawing/2016/5/13/chartex" xmlns:cx8="http://schemas.microsoft.com/office/drawing/2016/5/14/chartex" xmlns:mc="http://schemas.openxmlformats.org/markup-compatibility/2006" xmlns:aink="http://schemas.microsoft.com/office/drawing/2016/ink" xmlns:am3d="http://schemas.microsoft.com/office/drawing/2017/model3d" xmlns:o="urn:schemas-microsoft-com:office:office" xmlns:oel="http://schemas.microsoft.com/office/2019/extlst" xmlns:r="http://schemas.openxmlformats.org/officeDocument/2006/relationships" xmlns:m="http://schemas.openxmlformats.org/officeDocument/2006/math" xmlns:v="urn:schemas-microsoft-com:vml" xmlns:wp14="http://schemas.microsoft.com/office/word/2010/wordprocessingDrawing" xmlns:wp="http://schemas.openxmlformats.org/drawingml/2006/wordprocessingDrawing" xmlns:w10="urn:schemas-microsoft-com:office:word" xmlns:w="http://schemas.openxmlformats.org/wordprocessingml/2006/main" xmlns:w14="http://schemas.microsoft.com/office/word/2010/wordml" xmlns:w15="http://schemas.microsoft.com/office/word/2012/wordml" xmlns:w16cex="http://schemas.microsoft.com/office/word/2018/wordml/cex" xmlns:w16cid="http://schemas.microsoft.com/office/word/2016/wordml/cid" xmlns:w16="http://schemas.microsoft.com/office/word/2018/wordml" xmlns:w16sdtdh="http://schemas.microsoft.com/office/word/2020/wordml/sdtdatahash" xmlns:w16se="http://schemas.microsoft.com/office/word/2015/wordml/symex" xmlns:wpg="http://schemas.microsoft.com/office/word/2010/wordprocessingGroup" xmlns:wpi="http://schemas.microsoft.com/office/word/2010/wordprocessingInk" xmlns:wne="http://schemas.microsoft.com/office/word/2006/wordml" xmlns:wps="http://schemas.microsoft.com/office/word/2010/wordprocessingShape" mc:Ignorable="w14 w15 w16se w16cid w16 w16cex w16sdtdh wp14">
   <w:endnote w:type="separator" w:id="-1">
     <w:p>
       <w:pPr>
@@ -1316,7 +1351,7 @@
 </file>
 
 <file path=word/footnotes.xml><?xml version="1.0" encoding="utf-8"?>
-<w:footnotes xmlns:wpc="http://schemas.microsoft.com/office/word/2010/wordprocessingCanvas" xmlns:cx="http://schemas.microsoft.com/office/drawing/2014/chartex" xmlns:cx1="http://schemas.microsoft.com/office/drawing/2015/9/8/chartex" xmlns:cx2="http://schemas.microsoft.com/office/drawing/2015/10/21/chartex" xmlns:cx3="http://schemas.microsoft.com/office/drawing/2016/5/9/chartex" xmlns:cx4="http://schemas.microsoft.com/office/drawing/2016/5/10/chartex" xmlns:cx5="http://schemas.microsoft.com/office/drawing/2016/5/11/chartex" xmlns:cx6="http://schemas.microsoft.com/office/drawing/2016/5/12/chartex" xmlns:cx7="http://schemas.microsoft.com/office/drawing/2016/5/13/chartex" xmlns:cx8="http://schemas.microsoft.com/office/drawing/2016/5/14/chartex" xmlns:mc="http://schemas.openxmlformats.org/markup-compatibility/2006" xmlns:aink="http://schemas.microsoft.com/office/drawing/2016/ink" xmlns:am3d="http://schemas.microsoft.com/office/drawing/2017/model3d" xmlns:o="urn:schemas-microsoft-com:office:office" xmlns:oel="http://schemas.microsoft.com/office/2019/extlst" xmlns:r="http://schemas.openxmlformats.org/officeDocument/2006/relationships" xmlns:m="http://schemas.openxmlformats.org/officeDocument/2006/math" xmlns:v="urn:schemas-microsoft-com:vml" xmlns:wp14="http://schemas.microsoft.com/office/word/2010/wordprocessingDrawing" xmlns:wp="http://schemas.openxmlformats.org/drawingml/2006/wordprocessingDrawing" xmlns:w10="urn:schemas-microsoft-com:office:word" xmlns:w="http://schemas.openxmlformats.org/wordprocessingml/2006/main" xmlns:w14="http://schemas.microsoft.com/office/word/2010/wordml" xmlns:w15="http://schemas.microsoft.com/office/word/2012/wordml" xmlns:w16cex="http://schemas.microsoft.com/office/word/2018/wordml/cex" xmlns:w16cid="http://schemas.microsoft.com/office/word/2016/wordml/cid" xmlns:w16="http://schemas.microsoft.com/office/word/2018/wordml" xmlns:w16du="http://schemas.microsoft.com/office/word/2023/wordml/word16du" xmlns:w16sdtdh="http://schemas.microsoft.com/office/word/2020/wordml/sdtdatahash" xmlns:w16sdtfl="http://schemas.microsoft.com/office/word/2024/wordml/sdtformatlock" xmlns:w16se="http://schemas.microsoft.com/office/word/2015/wordml/symex" xmlns:wpg="http://schemas.microsoft.com/office/word/2010/wordprocessingGroup" xmlns:wpi="http://schemas.microsoft.com/office/word/2010/wordprocessingInk" xmlns:wne="http://schemas.microsoft.com/office/word/2006/wordml" xmlns:wps="http://schemas.microsoft.com/office/word/2010/wordprocessingShape" mc:Ignorable="w14 w15 w16se w16cid w16 w16cex w16sdtdh w16sdtfl w16du wp14">
+<w:footnotes xmlns:wpc="http://schemas.microsoft.com/office/word/2010/wordprocessingCanvas" xmlns:cx="http://schemas.microsoft.com/office/drawing/2014/chartex" xmlns:cx1="http://schemas.microsoft.com/office/drawing/2015/9/8/chartex" xmlns:cx2="http://schemas.microsoft.com/office/drawing/2015/10/21/chartex" xmlns:cx3="http://schemas.microsoft.com/office/drawing/2016/5/9/chartex" xmlns:cx4="http://schemas.microsoft.com/office/drawing/2016/5/10/chartex" xmlns:cx5="http://schemas.microsoft.com/office/drawing/2016/5/11/chartex" xmlns:cx6="http://schemas.microsoft.com/office/drawing/2016/5/12/chartex" xmlns:cx7="http://schemas.microsoft.com/office/drawing/2016/5/13/chartex" xmlns:cx8="http://schemas.microsoft.com/office/drawing/2016/5/14/chartex" xmlns:mc="http://schemas.openxmlformats.org/markup-compatibility/2006" xmlns:aink="http://schemas.microsoft.com/office/drawing/2016/ink" xmlns:am3d="http://schemas.microsoft.com/office/drawing/2017/model3d" xmlns:o="urn:schemas-microsoft-com:office:office" xmlns:oel="http://schemas.microsoft.com/office/2019/extlst" xmlns:r="http://schemas.openxmlformats.org/officeDocument/2006/relationships" xmlns:m="http://schemas.openxmlformats.org/officeDocument/2006/math" xmlns:v="urn:schemas-microsoft-com:vml" xmlns:wp14="http://schemas.microsoft.com/office/word/2010/wordprocessingDrawing" xmlns:wp="http://schemas.openxmlformats.org/drawingml/2006/wordprocessingDrawing" xmlns:w10="urn:schemas-microsoft-com:office:word" xmlns:w="http://schemas.openxmlformats.org/wordprocessingml/2006/main" xmlns:w14="http://schemas.microsoft.com/office/word/2010/wordml" xmlns:w15="http://schemas.microsoft.com/office/word/2012/wordml" xmlns:w16cex="http://schemas.microsoft.com/office/word/2018/wordml/cex" xmlns:w16cid="http://schemas.microsoft.com/office/word/2016/wordml/cid" xmlns:w16="http://schemas.microsoft.com/office/word/2018/wordml" xmlns:w16sdtdh="http://schemas.microsoft.com/office/word/2020/wordml/sdtdatahash" xmlns:w16se="http://schemas.microsoft.com/office/word/2015/wordml/symex" xmlns:wpg="http://schemas.microsoft.com/office/word/2010/wordprocessingGroup" xmlns:wpi="http://schemas.microsoft.com/office/word/2010/wordprocessingInk" xmlns:wne="http://schemas.microsoft.com/office/word/2006/wordml" xmlns:wps="http://schemas.microsoft.com/office/word/2010/wordprocessingShape" mc:Ignorable="w14 w15 w16se w16cid w16 w16cex w16sdtdh wp14">
   <w:footnote w:type="separator" w:id="-1">
     <w:p>
       <w:pPr>
@@ -1341,7 +1376,7 @@
 </file>
 
 <file path=word/numbering.xml><?xml version="1.0" encoding="utf-8"?>
-<w:numbering xmlns:wpc="http://schemas.microsoft.com/office/word/2010/wordprocessingCanvas" xmlns:cx="http://schemas.microsoft.com/office/drawing/2014/chartex" xmlns:cx1="http://schemas.microsoft.com/office/drawing/2015/9/8/chartex" xmlns:cx2="http://schemas.microsoft.com/office/drawing/2015/10/21/chartex" xmlns:cx3="http://schemas.microsoft.com/office/drawing/2016/5/9/chartex" xmlns:cx4="http://schemas.microsoft.com/office/drawing/2016/5/10/chartex" xmlns:cx5="http://schemas.microsoft.com/office/drawing/2016/5/11/chartex" xmlns:cx6="http://schemas.microsoft.com/office/drawing/2016/5/12/chartex" xmlns:cx7="http://schemas.microsoft.com/office/drawing/2016/5/13/chartex" xmlns:cx8="http://schemas.microsoft.com/office/drawing/2016/5/14/chartex" xmlns:mc="http://schemas.openxmlformats.org/markup-compatibility/2006" xmlns:aink="http://schemas.microsoft.com/office/drawing/2016/ink" xmlns:am3d="http://schemas.microsoft.com/office/drawing/2017/model3d" xmlns:o="urn:schemas-microsoft-com:office:office" xmlns:oel="http://schemas.microsoft.com/office/2019/extlst" xmlns:r="http://schemas.openxmlformats.org/officeDocument/2006/relationships" xmlns:m="http://schemas.openxmlformats.org/officeDocument/2006/math" xmlns:v="urn:schemas-microsoft-com:vml" xmlns:wp14="http://schemas.microsoft.com/office/word/2010/wordprocessingDrawing" xmlns:wp="http://schemas.openxmlformats.org/drawingml/2006/wordprocessingDrawing" xmlns:w10="urn:schemas-microsoft-com:office:word" xmlns:w="http://schemas.openxmlformats.org/wordprocessingml/2006/main" xmlns:w14="http://schemas.microsoft.com/office/word/2010/wordml" xmlns:w15="http://schemas.microsoft.com/office/word/2012/wordml" xmlns:w16cex="http://schemas.microsoft.com/office/word/2018/wordml/cex" xmlns:w16cid="http://schemas.microsoft.com/office/word/2016/wordml/cid" xmlns:w16="http://schemas.microsoft.com/office/word/2018/wordml" xmlns:w16du="http://schemas.microsoft.com/office/word/2023/wordml/word16du" xmlns:w16sdtdh="http://schemas.microsoft.com/office/word/2020/wordml/sdtdatahash" xmlns:w16sdtfl="http://schemas.microsoft.com/office/word/2024/wordml/sdtformatlock" xmlns:w16se="http://schemas.microsoft.com/office/word/2015/wordml/symex" xmlns:wpg="http://schemas.microsoft.com/office/word/2010/wordprocessingGroup" xmlns:wpi="http://schemas.microsoft.com/office/word/2010/wordprocessingInk" xmlns:wne="http://schemas.microsoft.com/office/word/2006/wordml" xmlns:wps="http://schemas.microsoft.com/office/word/2010/wordprocessingShape" mc:Ignorable="w14 w15 w16se w16cid w16 w16cex w16sdtdh w16sdtfl w16du wp14">
+<w:numbering xmlns:wpc="http://schemas.microsoft.com/office/word/2010/wordprocessingCanvas" xmlns:cx="http://schemas.microsoft.com/office/drawing/2014/chartex" xmlns:cx1="http://schemas.microsoft.com/office/drawing/2015/9/8/chartex" xmlns:cx2="http://schemas.microsoft.com/office/drawing/2015/10/21/chartex" xmlns:cx3="http://schemas.microsoft.com/office/drawing/2016/5/9/chartex" xmlns:cx4="http://schemas.microsoft.com/office/drawing/2016/5/10/chartex" xmlns:cx5="http://schemas.microsoft.com/office/drawing/2016/5/11/chartex" xmlns:cx6="http://schemas.microsoft.com/office/drawing/2016/5/12/chartex" xmlns:cx7="http://schemas.microsoft.com/office/drawing/2016/5/13/chartex" xmlns:cx8="http://schemas.microsoft.com/office/drawing/2016/5/14/chartex" xmlns:mc="http://schemas.openxmlformats.org/markup-compatibility/2006" xmlns:aink="http://schemas.microsoft.com/office/drawing/2016/ink" xmlns:am3d="http://schemas.microsoft.com/office/drawing/2017/model3d" xmlns:o="urn:schemas-microsoft-com:office:office" xmlns:oel="http://schemas.microsoft.com/office/2019/extlst" xmlns:r="http://schemas.openxmlformats.org/officeDocument/2006/relationships" xmlns:m="http://schemas.openxmlformats.org/officeDocument/2006/math" xmlns:v="urn:schemas-microsoft-com:vml" xmlns:wp14="http://schemas.microsoft.com/office/word/2010/wordprocessingDrawing" xmlns:wp="http://schemas.openxmlformats.org/drawingml/2006/wordprocessingDrawing" xmlns:w10="urn:schemas-microsoft-com:office:word" xmlns:w="http://schemas.openxmlformats.org/wordprocessingml/2006/main" xmlns:w14="http://schemas.microsoft.com/office/word/2010/wordml" xmlns:w15="http://schemas.microsoft.com/office/word/2012/wordml" xmlns:w16cex="http://schemas.microsoft.com/office/word/2018/wordml/cex" xmlns:w16cid="http://schemas.microsoft.com/office/word/2016/wordml/cid" xmlns:w16="http://schemas.microsoft.com/office/word/2018/wordml" xmlns:w16sdtdh="http://schemas.microsoft.com/office/word/2020/wordml/sdtdatahash" xmlns:w16se="http://schemas.microsoft.com/office/word/2015/wordml/symex" xmlns:wpg="http://schemas.microsoft.com/office/word/2010/wordprocessingGroup" xmlns:wpi="http://schemas.microsoft.com/office/word/2010/wordprocessingInk" xmlns:wne="http://schemas.microsoft.com/office/word/2006/wordml" xmlns:wps="http://schemas.microsoft.com/office/word/2010/wordprocessingShape" mc:Ignorable="w14 w15 w16se w16cid w16 w16cex w16sdtdh wp14">
   <w:abstractNum w:abstractNumId="0" w15:restartNumberingAfterBreak="0">
     <w:nsid w:val="4D974DD3"/>
     <w:multiLevelType w:val="multilevel"/>
@@ -1650,7 +1685,7 @@
 </file>
 
 <file path=word/styles.xml><?xml version="1.0" encoding="utf-8"?>
-<w:styles xmlns:mc="http://schemas.openxmlformats.org/markup-compatibility/2006" xmlns:r="http://schemas.openxmlformats.org/officeDocument/2006/relationships" xmlns:w="http://schemas.openxmlformats.org/wordprocessingml/2006/main" xmlns:w14="http://schemas.microsoft.com/office/word/2010/wordml" xmlns:w15="http://schemas.microsoft.com/office/word/2012/wordml" xmlns:w16cex="http://schemas.microsoft.com/office/word/2018/wordml/cex" xmlns:w16cid="http://schemas.microsoft.com/office/word/2016/wordml/cid" xmlns:w16="http://schemas.microsoft.com/office/word/2018/wordml" xmlns:w16du="http://schemas.microsoft.com/office/word/2023/wordml/word16du" xmlns:w16sdtdh="http://schemas.microsoft.com/office/word/2020/wordml/sdtdatahash" xmlns:w16sdtfl="http://schemas.microsoft.com/office/word/2024/wordml/sdtformatlock" xmlns:w16se="http://schemas.microsoft.com/office/word/2015/wordml/symex" mc:Ignorable="w14 w15 w16se w16cid w16 w16cex w16sdtdh w16sdtfl w16du">
+<w:styles xmlns:mc="http://schemas.openxmlformats.org/markup-compatibility/2006" xmlns:r="http://schemas.openxmlformats.org/officeDocument/2006/relationships" xmlns:w="http://schemas.openxmlformats.org/wordprocessingml/2006/main" xmlns:w14="http://schemas.microsoft.com/office/word/2010/wordml" xmlns:w15="http://schemas.microsoft.com/office/word/2012/wordml" xmlns:w16cex="http://schemas.microsoft.com/office/word/2018/wordml/cex" xmlns:w16cid="http://schemas.microsoft.com/office/word/2016/wordml/cid" xmlns:w16="http://schemas.microsoft.com/office/word/2018/wordml" xmlns:w16sdtdh="http://schemas.microsoft.com/office/word/2020/wordml/sdtdatahash" xmlns:w16se="http://schemas.microsoft.com/office/word/2015/wordml/symex" mc:Ignorable="w14 w15 w16se w16cid w16 w16cex w16sdtdh">
   <w:docDefaults>
     <w:rPrDefault>
       <w:rPr>
@@ -2252,6 +2287,7 @@
   <w:style w:type="character" w:default="1" w:styleId="Fontepargpadro">
     <w:name w:val="Default Paragraph Font"/>
     <w:uiPriority w:val="1"/>
+    <w:semiHidden/>
     <w:unhideWhenUsed/>
   </w:style>
   <w:style w:type="table" w:default="1" w:styleId="Tabelanormal">

</xml_diff>